<commit_message>
John Travolta: revisão da Parte 4
Co-Authored-By: Claude Opus 5.5 <noreply@anthropic.com>
Claude-Session: https://claude.ai/code/session_01MJjUEEZrxQDEUifKK2vj9g
</commit_message>
<xml_diff>
--- a/roteiros/john-travolta/Travolta_Parte4.docx
+++ b/roteiros/john-travolta/Travolta_Parte4.docx
@@ -55,7 +55,7 @@
         <w:rPr>
           <w:color w:val="000000"/>
         </w:rPr>
-        <w:t>Um dos homens que estavam naquela ambulância tinha guardado uma cópia do papel que John assinou naquela manhã.</w:t>
+        <w:t>Ainda segundo essa acusação, um dos homens que estavam naquela ambulância tinha guardado uma cópia do papel que John assinou naquela manhã.</w:t>
       </w:r>
     </w:p>
     <w:p>
@@ -231,7 +231,7 @@
         <w:rPr>
           <w:color w:val="000000"/>
         </w:rPr>
-        <w:t>O julgamento começou num tribunal lotado. Jornalistas do mundo inteiro estavam ali.</w:t>
+        <w:t>O julgamento começou. Jornalistas de vários países acompanhavam o caso.</w:t>
       </w:r>
     </w:p>
     <w:p>
@@ -271,15 +271,7 @@
         <w:rPr>
           <w:color w:val="000000"/>
         </w:rPr>
-        <w:t>E então chegou a pergunta que ninguém da família tinha respondido em público até ali.</w:t>
-      </w:r>
-    </w:p>
-    <w:p>
-      <w:r>
-        <w:rPr>
-          <w:color w:val="000000"/>
-        </w:rPr>
-        <w:t>Qual era, de fato, a condição de saúde de Jett?</w:t>
+        <w:t>E então ele falou sobre o assunto que a família nunca tinha confirmado em público.</w:t>
       </w:r>
     </w:p>
     <w:p>
@@ -487,7 +479,7 @@
         <w:rPr>
           <w:color w:val="000000"/>
         </w:rPr>
-        <w:t>Depois da morte de Jett, aquele bebê era o sinal de que a vida podia continuar.</w:t>
+        <w:t>Depois da morte de Jett, aquela gravidez foi recebida como um recomeço.</w:t>
       </w:r>
     </w:p>
     <w:p>
@@ -511,7 +503,7 @@
         <w:rPr>
           <w:color w:val="000000"/>
         </w:rPr>
-        <w:t>Pela primeira vez em quase dois anos, a casa dos Travolta voltou a ter choro de bebê.</w:t>
+        <w:t>Pela primeira vez em dez anos, a casa dos Travolta voltou a ter choro de bebê.</w:t>
       </w:r>
     </w:p>
     <w:p>

</xml_diff>